<commit_message>
Update SEO agents, skills, and learning loop
</commit_message>
<xml_diff>
--- a/clients/fanash/deliverables/florida-divorce-core/florida-divorce-core.docx
+++ b/clients/fanash/deliverables/florida-divorce-core/florida-divorce-core.docx
@@ -107,7 +107,7 @@
         </w:rPr>
         <w:t xml:space="preserve">At least one spouse must have lived in Florida for six months before filing a petition for dissolution of marriage.</w:t>
       </w:r>
-      <w:hyperlink w:history="1" r:id="rIdnzdhmeet6xtemrenzocqy">
+      <w:hyperlink w:history="1" r:id="rId00ybddf7b91gcvjnfifu6">
         <w:r>
           <w:rPr>
             <w:rFonts w:ascii="Arial" w:cs="Arial" w:eastAsia="Arial" w:hAnsi="Arial"/>
@@ -153,7 +153,7 @@
         </w:rPr>
         <w:t xml:space="preserve">Florida permits dissolution when the marriage is irretrievably broken. A separate statutory ground applies after one spouse has been adjudged mentally incapacitated for at least three years.</w:t>
       </w:r>
-      <w:hyperlink w:history="1" r:id="rIdmny19mqavy4puicpzmt2z">
+      <w:hyperlink w:history="1" r:id="rIdowcbwow1krkvvppcfhuab">
         <w:r>
           <w:rPr>
             <w:rFonts w:ascii="Arial" w:cs="Arial" w:eastAsia="Arial" w:hAnsi="Arial"/>
@@ -205,7 +205,7 @@
         </w:rPr>
         <w:t xml:space="preserve">A court generally cannot enter the final judgment until at least 20 days after the original petition is filed. The court may act sooner when delaying would cause injustice.</w:t>
       </w:r>
-      <w:hyperlink w:history="1" r:id="rIdgiz728cydztjj_qvvf284">
+      <w:hyperlink w:history="1" r:id="rIdmlm8l99tic_ppd34sbmia">
         <w:r>
           <w:rPr>
             <w:rFonts w:ascii="Arial" w:cs="Arial" w:eastAsia="Arial" w:hAnsi="Arial"/>
@@ -271,39 +271,22 @@
     </w:p>
     <w:p>
       <w:pPr>
-        <w:pStyle w:val="Heading3"/>
-        <w:keepNext/>
-      </w:pPr>
-      <w:r>
-        <w:rPr>
-          <w:rFonts w:ascii="Arial" w:cs="Arial" w:eastAsia="Arial" w:hAnsi="Arial"/>
-          <w:b/>
-          <w:bCs/>
-          <w:color w:val="2E5090"/>
-          <w:sz w:val="26"/>
-          <w:szCs w:val="26"/>
-        </w:rPr>
-        <w:t xml:space="preserve">Uncontested divorce</w:t>
-      </w:r>
-    </w:p>
-    <w:p>
-      <w:pPr>
-        <w:widowControl/>
-        <w:spacing w:after="120" w:before="120" w:line="300"/>
-      </w:pPr>
-      <w:r>
-        <w:rPr>
-          <w:rFonts w:ascii="Arial" w:cs="Arial" w:eastAsia="Arial" w:hAnsi="Arial"/>
-          <w:b w:val="false"/>
-          <w:bCs w:val="false"/>
-          <w:i w:val="false"/>
-          <w:iCs w:val="false"/>
-          <w:sz w:val="24"/>
-          <w:szCs w:val="24"/>
-        </w:rPr>
-        <w:t xml:space="preserve">An </w:t>
-      </w:r>
-      <w:hyperlink w:history="1" r:id="rIdti0gmi_n3cppsevxf1z8-">
+        <w:widowControl/>
+        <w:spacing w:after="120" w:before="120" w:line="300"/>
+      </w:pPr>
+      <w:r>
+        <w:rPr>
+          <w:rFonts w:ascii="Arial" w:cs="Arial" w:eastAsia="Arial" w:hAnsi="Arial"/>
+          <w:b w:val="false"/>
+          <w:bCs w:val="false"/>
+          <w:i w:val="false"/>
+          <w:iCs w:val="false"/>
+          <w:sz w:val="24"/>
+          <w:szCs w:val="24"/>
+        </w:rPr>
+        <w:t xml:space="preserve">If you are unsure whether divorce is the right legal path, our </w:t>
+      </w:r>
+      <w:hyperlink w:history="1" r:id="rIdxftda9woyafu0ayqlvhw2">
         <w:r>
           <w:rPr>
             <w:rFonts w:ascii="Arial" w:cs="Arial" w:eastAsia="Arial" w:hAnsi="Arial"/>
@@ -316,38 +299,20 @@
             <w:szCs w:val="24"/>
             <w:u w:val="single" w:color="2E5090"/>
           </w:rPr>
-          <w:t xml:space="preserve">uncontested divorce</w:t>
-        </w:r>
-      </w:hyperlink>
-      <w:r>
-        <w:rPr>
-          <w:rFonts w:ascii="Arial" w:cs="Arial" w:eastAsia="Arial" w:hAnsi="Arial"/>
-          <w:b w:val="false"/>
-          <w:bCs w:val="false"/>
-          <w:i w:val="false"/>
-          <w:iCs w:val="false"/>
-          <w:sz w:val="24"/>
-          <w:szCs w:val="24"/>
-        </w:rPr>
-        <w:t xml:space="preserve"> may be available when both spouses have resolved every issue. The agreement must address property, debt, support, and all child-related terms that apply.</w:t>
-      </w:r>
-    </w:p>
-    <w:p>
-      <w:pPr>
-        <w:widowControl/>
-        <w:spacing w:after="120" w:before="120" w:line="300"/>
-      </w:pPr>
-      <w:r>
-        <w:rPr>
-          <w:rFonts w:ascii="Arial" w:cs="Arial" w:eastAsia="Arial" w:hAnsi="Arial"/>
-          <w:b w:val="false"/>
-          <w:bCs w:val="false"/>
-          <w:i w:val="false"/>
-          <w:iCs w:val="false"/>
-          <w:sz w:val="24"/>
-          <w:szCs w:val="24"/>
-        </w:rPr>
-        <w:t xml:space="preserve">Agreement does not make accuracy optional. We can help translate decisions into complete documents, identify missing terms, prepare required materials, and explain what to expect at the final hearing.</w:t>
+          <w:t xml:space="preserve">Florida annulment guidance</w:t>
+        </w:r>
+      </w:hyperlink>
+      <w:r>
+        <w:rPr>
+          <w:rFonts w:ascii="Arial" w:cs="Arial" w:eastAsia="Arial" w:hAnsi="Arial"/>
+          <w:b w:val="false"/>
+          <w:bCs w:val="false"/>
+          <w:i w:val="false"/>
+          <w:iCs w:val="false"/>
+          <w:sz w:val="24"/>
+          <w:szCs w:val="24"/>
+        </w:rPr>
+        <w:t xml:space="preserve"> explains how that separate option differs from divorce and what to consider before filing.</w:t>
       </w:r>
     </w:p>
     <w:p>
@@ -364,27 +329,27 @@
           <w:sz w:val="26"/>
           <w:szCs w:val="26"/>
         </w:rPr>
-        <w:t xml:space="preserve">Mediation and negotiated settlement</w:t>
-      </w:r>
-    </w:p>
-    <w:p>
-      <w:pPr>
-        <w:widowControl/>
-        <w:spacing w:after="120" w:before="120" w:line="300"/>
-      </w:pPr>
-      <w:r>
-        <w:rPr>
-          <w:rFonts w:ascii="Arial" w:cs="Arial" w:eastAsia="Arial" w:hAnsi="Arial"/>
-          <w:b w:val="false"/>
-          <w:bCs w:val="false"/>
-          <w:i w:val="false"/>
-          <w:iCs w:val="false"/>
-          <w:sz w:val="24"/>
-          <w:szCs w:val="24"/>
-        </w:rPr>
-        <w:t xml:space="preserve">Many spouses use </w:t>
-      </w:r>
-      <w:hyperlink w:history="1" r:id="rIdurl8ewzihu2s69ai1rj40">
+        <w:t xml:space="preserve">Uncontested divorce</w:t>
+      </w:r>
+    </w:p>
+    <w:p>
+      <w:pPr>
+        <w:widowControl/>
+        <w:spacing w:after="120" w:before="120" w:line="300"/>
+      </w:pPr>
+      <w:r>
+        <w:rPr>
+          <w:rFonts w:ascii="Arial" w:cs="Arial" w:eastAsia="Arial" w:hAnsi="Arial"/>
+          <w:b w:val="false"/>
+          <w:bCs w:val="false"/>
+          <w:i w:val="false"/>
+          <w:iCs w:val="false"/>
+          <w:sz w:val="24"/>
+          <w:szCs w:val="24"/>
+        </w:rPr>
+        <w:t xml:space="preserve">An </w:t>
+      </w:r>
+      <w:hyperlink w:history="1" r:id="rIdmei6qch176fkni9gzssqq">
         <w:r>
           <w:rPr>
             <w:rFonts w:ascii="Arial" w:cs="Arial" w:eastAsia="Arial" w:hAnsi="Arial"/>
@@ -397,38 +362,38 @@
             <w:szCs w:val="24"/>
             <w:u w:val="single" w:color="2E5090"/>
           </w:rPr>
-          <w:t xml:space="preserve">mediation during divorce</w:t>
-        </w:r>
-      </w:hyperlink>
-      <w:r>
-        <w:rPr>
-          <w:rFonts w:ascii="Arial" w:cs="Arial" w:eastAsia="Arial" w:hAnsi="Arial"/>
-          <w:b w:val="false"/>
-          <w:bCs w:val="false"/>
-          <w:i w:val="false"/>
-          <w:iCs w:val="false"/>
-          <w:sz w:val="24"/>
-          <w:szCs w:val="24"/>
-        </w:rPr>
-        <w:t xml:space="preserve"> to discuss disputed terms. Your attorney can prepare you, evaluate proposals, and help protect your interests during that process.</w:t>
-      </w:r>
-    </w:p>
-    <w:p>
-      <w:pPr>
-        <w:widowControl/>
-        <w:spacing w:after="120" w:before="120" w:line="300"/>
-      </w:pPr>
-      <w:r>
-        <w:rPr>
-          <w:rFonts w:ascii="Arial" w:cs="Arial" w:eastAsia="Arial" w:hAnsi="Arial"/>
-          <w:b w:val="false"/>
-          <w:bCs w:val="false"/>
-          <w:i w:val="false"/>
-          <w:iCs w:val="false"/>
-          <w:sz w:val="24"/>
-          <w:szCs w:val="24"/>
-        </w:rPr>
-        <w:t xml:space="preserve">We help you enter mediation with clear priorities, organized financial information, and a practical settlement range. We can also review proposed terms before you decide whether to sign.</w:t>
+          <w:t xml:space="preserve">uncontested divorce</w:t>
+        </w:r>
+      </w:hyperlink>
+      <w:r>
+        <w:rPr>
+          <w:rFonts w:ascii="Arial" w:cs="Arial" w:eastAsia="Arial" w:hAnsi="Arial"/>
+          <w:b w:val="false"/>
+          <w:bCs w:val="false"/>
+          <w:i w:val="false"/>
+          <w:iCs w:val="false"/>
+          <w:sz w:val="24"/>
+          <w:szCs w:val="24"/>
+        </w:rPr>
+        <w:t xml:space="preserve"> may be available when both spouses have resolved every issue. The agreement must address property, debt, support, and all child-related terms that apply.</w:t>
+      </w:r>
+    </w:p>
+    <w:p>
+      <w:pPr>
+        <w:widowControl/>
+        <w:spacing w:after="120" w:before="120" w:line="300"/>
+      </w:pPr>
+      <w:r>
+        <w:rPr>
+          <w:rFonts w:ascii="Arial" w:cs="Arial" w:eastAsia="Arial" w:hAnsi="Arial"/>
+          <w:b w:val="false"/>
+          <w:bCs w:val="false"/>
+          <w:i w:val="false"/>
+          <w:iCs w:val="false"/>
+          <w:sz w:val="24"/>
+          <w:szCs w:val="24"/>
+        </w:rPr>
+        <w:t xml:space="preserve">Agreement does not make accuracy optional. We can help translate decisions into complete documents, identify missing terms, prepare required materials, and explain what to expect at the final hearing.</w:t>
       </w:r>
     </w:p>
     <w:p>
@@ -445,27 +410,27 @@
           <w:sz w:val="26"/>
           <w:szCs w:val="26"/>
         </w:rPr>
-        <w:t xml:space="preserve">Contested divorce</w:t>
-      </w:r>
-    </w:p>
-    <w:p>
-      <w:pPr>
-        <w:widowControl/>
-        <w:spacing w:after="120" w:before="120" w:line="300"/>
-      </w:pPr>
-      <w:r>
-        <w:rPr>
-          <w:rFonts w:ascii="Arial" w:cs="Arial" w:eastAsia="Arial" w:hAnsi="Arial"/>
-          <w:b w:val="false"/>
-          <w:bCs w:val="false"/>
-          <w:i w:val="false"/>
-          <w:iCs w:val="false"/>
-          <w:sz w:val="24"/>
-          <w:szCs w:val="24"/>
-        </w:rPr>
-        <w:t xml:space="preserve">A </w:t>
-      </w:r>
-      <w:hyperlink w:history="1" r:id="rId8j-ffghypmqeqyghy2wif">
+        <w:t xml:space="preserve">Mediation and negotiated settlement</w:t>
+      </w:r>
+    </w:p>
+    <w:p>
+      <w:pPr>
+        <w:widowControl/>
+        <w:spacing w:after="120" w:before="120" w:line="300"/>
+      </w:pPr>
+      <w:r>
+        <w:rPr>
+          <w:rFonts w:ascii="Arial" w:cs="Arial" w:eastAsia="Arial" w:hAnsi="Arial"/>
+          <w:b w:val="false"/>
+          <w:bCs w:val="false"/>
+          <w:i w:val="false"/>
+          <w:iCs w:val="false"/>
+          <w:sz w:val="24"/>
+          <w:szCs w:val="24"/>
+        </w:rPr>
+        <w:t xml:space="preserve">Many spouses use </w:t>
+      </w:r>
+      <w:hyperlink w:history="1" r:id="rIddo62d_idnood2s8mppj38">
         <w:r>
           <w:rPr>
             <w:rFonts w:ascii="Arial" w:cs="Arial" w:eastAsia="Arial" w:hAnsi="Arial"/>
@@ -478,38 +443,38 @@
             <w:szCs w:val="24"/>
             <w:u w:val="single" w:color="2E5090"/>
           </w:rPr>
-          <w:t xml:space="preserve">contested divorce</w:t>
-        </w:r>
-      </w:hyperlink>
-      <w:r>
-        <w:rPr>
-          <w:rFonts w:ascii="Arial" w:cs="Arial" w:eastAsia="Arial" w:hAnsi="Arial"/>
-          <w:b w:val="false"/>
-          <w:bCs w:val="false"/>
-          <w:i w:val="false"/>
-          <w:iCs w:val="false"/>
-          <w:sz w:val="24"/>
-          <w:szCs w:val="24"/>
-        </w:rPr>
-        <w:t xml:space="preserve"> involves one or more unresolved issues. The work may include formal information exchange, financial analysis, negotiation, hearings, expert input, or preparation for trial.</w:t>
-      </w:r>
-    </w:p>
-    <w:p>
-      <w:pPr>
-        <w:widowControl/>
-        <w:spacing w:after="120" w:before="120" w:line="300"/>
-      </w:pPr>
-      <w:r>
-        <w:rPr>
-          <w:rFonts w:ascii="Arial" w:cs="Arial" w:eastAsia="Arial" w:hAnsi="Arial"/>
-          <w:b w:val="false"/>
-          <w:bCs w:val="false"/>
-          <w:i w:val="false"/>
-          <w:iCs w:val="false"/>
-          <w:sz w:val="24"/>
-          <w:szCs w:val="24"/>
-        </w:rPr>
-        <w:t xml:space="preserve">Contested does not mean every issue must reach trial. We identify the decisions that truly require court involvement while continuing to evaluate reasonable agreements on issues that can be resolved.</w:t>
+          <w:t xml:space="preserve">mediation during divorce</w:t>
+        </w:r>
+      </w:hyperlink>
+      <w:r>
+        <w:rPr>
+          <w:rFonts w:ascii="Arial" w:cs="Arial" w:eastAsia="Arial" w:hAnsi="Arial"/>
+          <w:b w:val="false"/>
+          <w:bCs w:val="false"/>
+          <w:i w:val="false"/>
+          <w:iCs w:val="false"/>
+          <w:sz w:val="24"/>
+          <w:szCs w:val="24"/>
+        </w:rPr>
+        <w:t xml:space="preserve"> to discuss disputed terms. Your attorney can prepare you, evaluate proposals, and help protect your interests during that process.</w:t>
+      </w:r>
+    </w:p>
+    <w:p>
+      <w:pPr>
+        <w:widowControl/>
+        <w:spacing w:after="120" w:before="120" w:line="300"/>
+      </w:pPr>
+      <w:r>
+        <w:rPr>
+          <w:rFonts w:ascii="Arial" w:cs="Arial" w:eastAsia="Arial" w:hAnsi="Arial"/>
+          <w:b w:val="false"/>
+          <w:bCs w:val="false"/>
+          <w:i w:val="false"/>
+          <w:iCs w:val="false"/>
+          <w:sz w:val="24"/>
+          <w:szCs w:val="24"/>
+        </w:rPr>
+        <w:t xml:space="preserve">We help you enter mediation with clear priorities, organized financial information, and a practical settlement range. We can also review proposed terms before you decide whether to sign.</w:t>
       </w:r>
     </w:p>
     <w:p>
@@ -526,27 +491,27 @@
           <w:sz w:val="26"/>
           <w:szCs w:val="26"/>
         </w:rPr>
-        <w:t xml:space="preserve">Cases requiring added financial or communication planning</w:t>
-      </w:r>
-    </w:p>
-    <w:p>
-      <w:pPr>
-        <w:widowControl/>
-        <w:spacing w:after="120" w:before="120" w:line="300"/>
-      </w:pPr>
-      <w:r>
-        <w:rPr>
-          <w:rFonts w:ascii="Arial" w:cs="Arial" w:eastAsia="Arial" w:hAnsi="Arial"/>
-          <w:b w:val="false"/>
-          <w:bCs w:val="false"/>
-          <w:i w:val="false"/>
-          <w:iCs w:val="false"/>
-          <w:sz w:val="24"/>
-          <w:szCs w:val="24"/>
-        </w:rPr>
-        <w:t xml:space="preserve">Long marriages may involve retirement income, insurance, complex property, and changing earning capacity. Our </w:t>
-      </w:r>
-      <w:hyperlink w:history="1" r:id="rIdrodhpczbkmpnarsejw11n">
+        <w:t xml:space="preserve">Contested divorce</w:t>
+      </w:r>
+    </w:p>
+    <w:p>
+      <w:pPr>
+        <w:widowControl/>
+        <w:spacing w:after="120" w:before="120" w:line="300"/>
+      </w:pPr>
+      <w:r>
+        <w:rPr>
+          <w:rFonts w:ascii="Arial" w:cs="Arial" w:eastAsia="Arial" w:hAnsi="Arial"/>
+          <w:b w:val="false"/>
+          <w:bCs w:val="false"/>
+          <w:i w:val="false"/>
+          <w:iCs w:val="false"/>
+          <w:sz w:val="24"/>
+          <w:szCs w:val="24"/>
+        </w:rPr>
+        <w:t xml:space="preserve">A </w:t>
+      </w:r>
+      <w:hyperlink w:history="1" r:id="rId1rbowsmklw0zmkcu9z37v">
         <w:r>
           <w:rPr>
             <w:rFonts w:ascii="Arial" w:cs="Arial" w:eastAsia="Arial" w:hAnsi="Arial"/>
@@ -559,6 +524,87 @@
             <w:szCs w:val="24"/>
             <w:u w:val="single" w:color="2E5090"/>
           </w:rPr>
+          <w:t xml:space="preserve">contested divorce</w:t>
+        </w:r>
+      </w:hyperlink>
+      <w:r>
+        <w:rPr>
+          <w:rFonts w:ascii="Arial" w:cs="Arial" w:eastAsia="Arial" w:hAnsi="Arial"/>
+          <w:b w:val="false"/>
+          <w:bCs w:val="false"/>
+          <w:i w:val="false"/>
+          <w:iCs w:val="false"/>
+          <w:sz w:val="24"/>
+          <w:szCs w:val="24"/>
+        </w:rPr>
+        <w:t xml:space="preserve"> involves one or more unresolved issues. The work may include formal information exchange, financial analysis, negotiation, hearings, expert input, or preparation for trial.</w:t>
+      </w:r>
+    </w:p>
+    <w:p>
+      <w:pPr>
+        <w:widowControl/>
+        <w:spacing w:after="120" w:before="120" w:line="300"/>
+      </w:pPr>
+      <w:r>
+        <w:rPr>
+          <w:rFonts w:ascii="Arial" w:cs="Arial" w:eastAsia="Arial" w:hAnsi="Arial"/>
+          <w:b w:val="false"/>
+          <w:bCs w:val="false"/>
+          <w:i w:val="false"/>
+          <w:iCs w:val="false"/>
+          <w:sz w:val="24"/>
+          <w:szCs w:val="24"/>
+        </w:rPr>
+        <w:t xml:space="preserve">Contested does not mean every issue must reach trial. We identify the decisions that truly require court involvement while continuing to evaluate reasonable agreements on issues that can be resolved.</w:t>
+      </w:r>
+    </w:p>
+    <w:p>
+      <w:pPr>
+        <w:pStyle w:val="Heading3"/>
+        <w:keepNext/>
+      </w:pPr>
+      <w:r>
+        <w:rPr>
+          <w:rFonts w:ascii="Arial" w:cs="Arial" w:eastAsia="Arial" w:hAnsi="Arial"/>
+          <w:b/>
+          <w:bCs/>
+          <w:color w:val="2E5090"/>
+          <w:sz w:val="26"/>
+          <w:szCs w:val="26"/>
+        </w:rPr>
+        <w:t xml:space="preserve">Cases requiring added financial or communication planning</w:t>
+      </w:r>
+    </w:p>
+    <w:p>
+      <w:pPr>
+        <w:widowControl/>
+        <w:spacing w:after="120" w:before="120" w:line="300"/>
+      </w:pPr>
+      <w:r>
+        <w:rPr>
+          <w:rFonts w:ascii="Arial" w:cs="Arial" w:eastAsia="Arial" w:hAnsi="Arial"/>
+          <w:b w:val="false"/>
+          <w:bCs w:val="false"/>
+          <w:i w:val="false"/>
+          <w:iCs w:val="false"/>
+          <w:sz w:val="24"/>
+          <w:szCs w:val="24"/>
+        </w:rPr>
+        <w:t xml:space="preserve">Long marriages may involve retirement income, insurance, complex property, and changing earning capacity. Our </w:t>
+      </w:r>
+      <w:hyperlink w:history="1" r:id="rId0qs6xgv3i3qy56d6y2s5g">
+        <w:r>
+          <w:rPr>
+            <w:rFonts w:ascii="Arial" w:cs="Arial" w:eastAsia="Arial" w:hAnsi="Arial"/>
+            <w:b/>
+            <w:bCs/>
+            <w:i w:val="false"/>
+            <w:iCs w:val="false"/>
+            <w:color w:val="2E5090"/>
+            <w:sz w:val="24"/>
+            <w:szCs w:val="24"/>
+            <w:u w:val="single" w:color="2E5090"/>
+          </w:rPr>
           <w:t xml:space="preserve">gray divorce guidance</w:t>
         </w:r>
       </w:hyperlink>
@@ -662,7 +708,7 @@
         </w:rPr>
         <w:t xml:space="preserve">Florida's equitable-distribution statute begins with the premise that marital assets and liabilities should be divided equally. A court may make an unequal distribution after considering the listed factors.</w:t>
       </w:r>
-      <w:hyperlink w:history="1" r:id="rIduvohmwt4jgi2masiib7nh">
+      <w:hyperlink w:history="1" r:id="rIdvsoib5l-ob00qaenvd1jq">
         <w:r>
           <w:rPr>
             <w:rFonts w:ascii="Arial" w:cs="Arial" w:eastAsia="Arial" w:hAnsi="Arial"/>
@@ -714,7 +760,7 @@
         </w:rPr>
         <w:t xml:space="preserve">A </w:t>
       </w:r>
-      <w:hyperlink w:history="1" r:id="rId7soedkevsxisyx4dmaibw">
+      <w:hyperlink w:history="1" r:id="rIdtrfgskwkuyl2llpiq-ppr">
         <w:r>
           <w:rPr>
             <w:rFonts w:ascii="Arial" w:cs="Arial" w:eastAsia="Arial" w:hAnsi="Arial"/>
@@ -777,7 +823,7 @@
         </w:rPr>
         <w:t xml:space="preserve">Florida law allows temporary, bridge-the-gap, rehabilitative, and durational alimony. The court must first make specific findings about one party's actual need and the other party's ability to pay.</w:t>
       </w:r>
-      <w:hyperlink w:history="1" r:id="rIdvz7iwtqevuq7etcqejeiq">
+      <w:hyperlink w:history="1" r:id="rIdixeme5oaew34kqq5mpncf">
         <w:r>
           <w:rPr>
             <w:rFonts w:ascii="Arial" w:cs="Arial" w:eastAsia="Arial" w:hAnsi="Arial"/>
@@ -844,9 +890,9 @@
           <w:sz w:val="24"/>
           <w:szCs w:val="24"/>
         </w:rPr>
-        <w:t xml:space="preserve">When children are involved, a parenting plan addresses parental responsibility, time-sharing, communication, and related details. Florida courts determine parenting issues through the child's best interests and the statutory factors.</w:t>
-      </w:r>
-      <w:hyperlink w:history="1" r:id="rId-ixzoih0blhnz_e6vhobo">
+        <w:t xml:space="preserve">When children are involved, a parenting plan addresses parental responsibility, time-sharing, communication, and related details. Unless another provision of § 61.13 applies or the parents agree to a schedule, Florida law presumes equal time-sharing is in the child's best interests.</w:t>
+      </w:r>
+      <w:hyperlink w:history="1" r:id="rIdb45jo--lgofwk2p8zxsez">
         <w:r>
           <w:rPr>
             <w:rFonts w:ascii="Arial" w:cs="Arial" w:eastAsia="Arial" w:hAnsi="Arial"/>
@@ -878,6 +924,24 @@
           <w:sz w:val="24"/>
           <w:szCs w:val="24"/>
         </w:rPr>
+        <w:t xml:space="preserve">The presumption is rebuttable. A parent challenging it must prove by a preponderance of the evidence that equal time-sharing is not in the child's best interests. Without a schedule agreed to by the parents and approved by the court, the court evaluates all statutory best-interests factors and makes specific written findings.</w:t>
+      </w:r>
+    </w:p>
+    <w:p>
+      <w:pPr>
+        <w:widowControl/>
+        <w:spacing w:after="120" w:before="120" w:line="300"/>
+      </w:pPr>
+      <w:r>
+        <w:rPr>
+          <w:rFonts w:ascii="Arial" w:cs="Arial" w:eastAsia="Arial" w:hAnsi="Arial"/>
+          <w:b w:val="false"/>
+          <w:bCs w:val="false"/>
+          <w:i w:val="false"/>
+          <w:iCs w:val="false"/>
+          <w:sz w:val="24"/>
+          <w:szCs w:val="24"/>
+        </w:rPr>
         <w:t xml:space="preserve">A workable proposal should reflect school, health needs, transportation, routines, communication, and safety. It should also be detailed enough to reduce avoidable disputes after the divorce.</w:t>
       </w:r>
     </w:p>
@@ -915,7 +979,7 @@
         </w:rPr>
         <w:t xml:space="preserve">Florida's child-support guideline amount is presumptive, but the statute permits adjustments under defined circumstances. The calculation begins with income and includes other legally relevant inputs.</w:t>
       </w:r>
-      <w:hyperlink w:history="1" r:id="rIdfp7qqbswuztxskzyavhyv">
+      <w:hyperlink w:history="1" r:id="rId5x-p2rf2wk5en81tnpnxq">
         <w:r>
           <w:rPr>
             <w:rFonts w:ascii="Arial" w:cs="Arial" w:eastAsia="Arial" w:hAnsi="Arial"/>
@@ -1055,7 +1119,7 @@
         </w:rPr>
         <w:t xml:space="preserve">Every case has its own facts, but a clear sequence can make the work more manageable. Our focused </w:t>
       </w:r>
-      <w:hyperlink w:history="1" r:id="rIdqk2d9zpcxaq43il_gnhtu">
+      <w:hyperlink w:history="1" r:id="rIdc6b_0gjpvm852bsslnxxl">
         <w:r>
           <w:rPr>
             <w:rFonts w:ascii="Arial" w:cs="Arial" w:eastAsia="Arial" w:hAnsi="Arial"/>
@@ -1489,7 +1553,7 @@
         </w:rPr>
         <w:t xml:space="preserve">The Florida Bar lists Zuhair Diab Fanash as a member in good standing and eligible to practice in Florida.</w:t>
       </w:r>
-      <w:hyperlink w:history="1" r:id="rIdl8eyfsh-2ootdfh819ksj">
+      <w:hyperlink w:history="1" r:id="rId_obgdhffwihvrz4k5kepg">
         <w:r>
           <w:rPr>
             <w:rFonts w:ascii="Arial" w:cs="Arial" w:eastAsia="Arial" w:hAnsi="Arial"/>
@@ -1521,9 +1585,9 @@
           <w:sz w:val="24"/>
           <w:szCs w:val="24"/>
         </w:rPr>
-        <w:t xml:space="preserve">The firm's published profile identifies family law as his practice focus. Its stated approach is to build a case strategy around each client's circumstances and goals. It also describes constructive resolution and persistent advocacy when a case requires it.</w:t>
-      </w:r>
-      <w:hyperlink w:history="1" r:id="rId64usyk4g1io4cn2dfeeat">
+        <w:t xml:space="preserve">Zuhair Fanash focuses his practice on family law. We build your case strategy around your circumstances and goals. We pursue constructive resolution when possible and advocate persistently when court action is necessary.</w:t>
+      </w:r>
+      <w:hyperlink w:history="1" r:id="rId_gcpeecp0eloakfjizoak">
         <w:r>
           <w:rPr>
             <w:rFonts w:ascii="Arial" w:cs="Arial" w:eastAsia="Arial" w:hAnsi="Arial"/>
@@ -1678,9 +1742,9 @@
           <w:sz w:val="24"/>
           <w:szCs w:val="24"/>
         </w:rPr>
-        <w:t xml:space="preserve">Florida does not create a formal legal-separation marital status. However, a spouse may seek alimony or child support without filing for dissolution when the statutory requirements are satisfied.</w:t>
-      </w:r>
-      <w:hyperlink w:history="1" r:id="rId8ote5bd2f_0pnofpigzzs">
+        <w:t xml:space="preserve">Florida does not create a formal legal-separation marital status.</w:t>
+      </w:r>
+      <w:hyperlink w:history="1" r:id="rIdb6pe_ptbrox0sywmfzcxq">
         <w:r>
           <w:rPr>
             <w:rFonts w:ascii="Arial" w:cs="Arial" w:eastAsia="Arial" w:hAnsi="Arial"/>
@@ -1712,9 +1776,9 @@
           <w:sz w:val="24"/>
           <w:szCs w:val="24"/>
         </w:rPr>
-        <w:t xml:space="preserve">Florida law also allows support and a parenting plan when spouses live apart without dissolution.</w:t>
-      </w:r>
-      <w:hyperlink w:history="1" r:id="rIdfruyhkjmjznairsg6-ehk">
+        <w:t xml:space="preserve">A spouse may seek alimony or child support without filing for dissolution when the statutory requirements are satisfied.</w:t>
+      </w:r>
+      <w:hyperlink w:history="1" r:id="rIdi7__5c6mwpuaipisstxkt">
         <w:r>
           <w:rPr>
             <w:rFonts w:ascii="Arial" w:cs="Arial" w:eastAsia="Arial" w:hAnsi="Arial"/>
@@ -1730,6 +1794,40 @@
           <w:t xml:space="preserve">[11]</w:t>
         </w:r>
       </w:hyperlink>
+    </w:p>
+    <w:p>
+      <w:pPr>
+        <w:widowControl/>
+        <w:spacing w:after="120" w:before="120" w:line="300"/>
+      </w:pPr>
+      <w:r>
+        <w:rPr>
+          <w:rFonts w:ascii="Arial" w:cs="Arial" w:eastAsia="Arial" w:hAnsi="Arial"/>
+          <w:b w:val="false"/>
+          <w:bCs w:val="false"/>
+          <w:i w:val="false"/>
+          <w:iCs w:val="false"/>
+          <w:sz w:val="24"/>
+          <w:szCs w:val="24"/>
+        </w:rPr>
+        <w:t xml:space="preserve">Florida law also allows support and a parenting plan when spouses live apart without dissolution.</w:t>
+      </w:r>
+      <w:hyperlink w:history="1" r:id="rIduakz5krmbnjugm9ns24vj">
+        <w:r>
+          <w:rPr>
+            <w:rFonts w:ascii="Arial" w:cs="Arial" w:eastAsia="Arial" w:hAnsi="Arial"/>
+            <w:b w:val="false"/>
+            <w:bCs w:val="false"/>
+            <w:i w:val="false"/>
+            <w:iCs w:val="false"/>
+            <w:color w:val="666666"/>
+            <w:sz w:val="18"/>
+            <w:szCs w:val="18"/>
+            <w:vertAlign w:val="superscript"/>
+          </w:rPr>
+          <w:t xml:space="preserve">[12]</w:t>
+        </w:r>
+      </w:hyperlink>
       <w:r>
         <w:rPr>
           <w:rFonts w:ascii="Arial" w:cs="Arial" w:eastAsia="Arial" w:hAnsi="Arial"/>
@@ -1742,7 +1840,7 @@
         </w:rPr>
         <w:t xml:space="preserve"> Our guide to </w:t>
       </w:r>
-      <w:hyperlink w:history="1" r:id="rId1poykdfsnpqv60ob5-eqo">
+      <w:hyperlink w:history="1" r:id="rIdakjjdzq7zkxtnyvtrt-st">
         <w:r>
           <w:rPr>
             <w:rFonts w:ascii="Arial" w:cs="Arial" w:eastAsia="Arial" w:hAnsi="Arial"/>
@@ -1908,7 +2006,7 @@
           <w:sz w:val="24"/>
           <w:szCs w:val="24"/>
         </w:rPr>
-        <w:t xml:space="preserve">Cost depends on the work required, the issues involved, the level of agreement, and how the matter develops. Ask current intake to explain the available engagement structure and included work.</w:t>
+        <w:t xml:space="preserve">Cost depends on the work required, the issues involved, the level of agreement, and how the matter develops. Discuss the proposed engagement structure and included work before you decide how to proceed.</w:t>
       </w:r>
     </w:p>
     <w:p>
@@ -1961,7 +2059,7 @@
           <w:sz w:val="24"/>
           <w:szCs w:val="24"/>
         </w:rPr>
-        <w:t xml:space="preserve">Call Fanash Family Law at 800-468-0777 or email intake@fanashfamilylaw.com. The firm lists its Orlando office at 111 North Orange Avenue, Suite 800, Orlando, Florida 32801.</w:t>
+        <w:t xml:space="preserve">Call Fanash Family Law at 800-468-0777 or email intake@fanashfamilylaw.com. Our Orlando office is at 111 North Orange Avenue, Suite 800, Orlando, Florida 32801.</w:t>
       </w:r>
     </w:p>
     <w:p>
@@ -1995,7 +2093,7 @@
         </w:rPr>
         <w:t xml:space="preserve">[1] Fla. Stat. § 61.021 (residence requirement; current 2026 text) | </w:t>
       </w:r>
-      <w:hyperlink w:history="1" r:id="rIdhy8zcmqssye1om7yriame">
+      <w:hyperlink w:history="1" r:id="rId3kblhplm-hg33oi7epfox">
         <w:r>
           <w:rPr>
             <w:rFonts w:ascii="Arial" w:cs="Arial" w:eastAsia="Arial" w:hAnsi="Arial"/>
@@ -2022,7 +2120,7 @@
         </w:rPr>
         <w:t xml:space="preserve">[2] Fla. Stat. § 61.052 (dissolution grounds and residence proof; current 2026 text) | </w:t>
       </w:r>
-      <w:hyperlink w:history="1" r:id="rId9e3mrldotwdlkhazarkif">
+      <w:hyperlink w:history="1" r:id="rIdib4ln7ktv5djxy9nnxt_c">
         <w:r>
           <w:rPr>
             <w:rFonts w:ascii="Arial" w:cs="Arial" w:eastAsia="Arial" w:hAnsi="Arial"/>
@@ -2049,7 +2147,7 @@
         </w:rPr>
         <w:t xml:space="preserve">[3] Fla. Stat. § 61.19 (minimum period before final judgment; current 2026 text) | </w:t>
       </w:r>
-      <w:hyperlink w:history="1" r:id="rIdi59_fh35loleed0end_eo">
+      <w:hyperlink w:history="1" r:id="rIdotgq_rafub1itwnx7ehdy">
         <w:r>
           <w:rPr>
             <w:rFonts w:ascii="Arial" w:cs="Arial" w:eastAsia="Arial" w:hAnsi="Arial"/>
@@ -2076,7 +2174,7 @@
         </w:rPr>
         <w:t xml:space="preserve">[4] Fla. Stat. § 61.075 (equitable distribution; current 2026 text) | </w:t>
       </w:r>
-      <w:hyperlink w:history="1" r:id="rIdyysk6gdk2lglia6juwmwh">
+      <w:hyperlink w:history="1" r:id="rId2yin-0ejr9f0l8txwz4uy">
         <w:r>
           <w:rPr>
             <w:rFonts w:ascii="Arial" w:cs="Arial" w:eastAsia="Arial" w:hAnsi="Arial"/>
@@ -2103,7 +2201,7 @@
         </w:rPr>
         <w:t xml:space="preserve">[5] Fla. Stat. § 61.08 (alimony; current 2026 text) | </w:t>
       </w:r>
-      <w:hyperlink w:history="1" r:id="rIdrxgrbvf22cehaxl2cuj_y">
+      <w:hyperlink w:history="1" r:id="rId2b-dozmryjv-rfe7zxpv1">
         <w:r>
           <w:rPr>
             <w:rFonts w:ascii="Arial" w:cs="Arial" w:eastAsia="Arial" w:hAnsi="Arial"/>
@@ -2128,9 +2226,9 @@
           <w:sz w:val="24"/>
           <w:szCs w:val="24"/>
         </w:rPr>
-        <w:t xml:space="preserve">[6] Fla. Stat. § 61.13 (parenting plans, time-sharing, and best interests; current 2026 text) | </w:t>
-      </w:r>
-      <w:hyperlink w:history="1" r:id="rIdoxxrszqzg2y0_jtnjyv6q">
+        <w:t xml:space="preserve">[6] Fla. Stat. § 61.13(2)(c)1 and (3) (equal time-sharing presumption, parenting plans, best interests, and safety; current 2026 text) | </w:t>
+      </w:r>
+      <w:hyperlink w:history="1" r:id="rIdybcb8fi2sqpkw_fnahkbh">
         <w:r>
           <w:rPr>
             <w:rFonts w:ascii="Arial" w:cs="Arial" w:eastAsia="Arial" w:hAnsi="Arial"/>
@@ -2157,7 +2255,7 @@
         </w:rPr>
         <w:t xml:space="preserve">[7] Fla. Stat. § 61.30 (child-support guidelines; current 2026 text) | </w:t>
       </w:r>
-      <w:hyperlink w:history="1" r:id="rIdws1qukc2nh2bacpilxhhk">
+      <w:hyperlink w:history="1" r:id="rIdjod2qnliflfimcscd2yx-">
         <w:r>
           <w:rPr>
             <w:rFonts w:ascii="Arial" w:cs="Arial" w:eastAsia="Arial" w:hAnsi="Arial"/>
@@ -2184,7 +2282,7 @@
         </w:rPr>
         <w:t xml:space="preserve">[8] The Florida Bar member profile for Zuhair Diab Fanash, member number 124679 (accessed Sept. 15, 2026) | </w:t>
       </w:r>
-      <w:hyperlink w:history="1" r:id="rIdpjpdbsbkf7chx9hqacsfo">
+      <w:hyperlink w:history="1" r:id="rId_nd5umc7u8wz_mka-6b_e">
         <w:r>
           <w:rPr>
             <w:rFonts w:ascii="Arial" w:cs="Arial" w:eastAsia="Arial" w:hAnsi="Arial"/>
@@ -2211,7 +2309,7 @@
         </w:rPr>
         <w:t xml:space="preserve">[9] Fanash Family Law attorney profile (accessed Sept. 15, 2026) | </w:t>
       </w:r>
-      <w:hyperlink w:history="1" r:id="rIdkewutkbk-c0stmgi7oo16">
+      <w:hyperlink w:history="1" r:id="rIdtwot8wfvgigoivxj5smax">
         <w:r>
           <w:rPr>
             <w:rFonts w:ascii="Arial" w:cs="Arial" w:eastAsia="Arial" w:hAnsi="Arial"/>
@@ -2236,9 +2334,9 @@
           <w:sz w:val="24"/>
           <w:szCs w:val="24"/>
         </w:rPr>
-        <w:t xml:space="preserve">[10] Fla. Stat. § 61.09 (support unconnected with dissolution; current 2026 text) | </w:t>
-      </w:r>
-      <w:hyperlink w:history="1" r:id="rIdvprd0qhxzte0muoys6x3s">
+        <w:t xml:space="preserve">[10] Fla. Stat. § 61.031 (dissolution from bonds of matrimony, not bed and board; current 2026 text) | </w:t>
+      </w:r>
+      <w:hyperlink w:history="1" r:id="rIdnj4qbnfbvnl7jj_ycdfdj">
         <w:r>
           <w:rPr>
             <w:rFonts w:ascii="Arial" w:cs="Arial" w:eastAsia="Arial" w:hAnsi="Arial"/>
@@ -2247,6 +2345,33 @@
             <w:szCs w:val="24"/>
             <w:u w:val="single"/>
           </w:rPr>
+          <w:t xml:space="preserve">https://www.leg.state.fl.us/Statutes/index.cfm?App_mode=Display_Statute&amp;URL=0000-0099/0061/Sections/0061.031.html</w:t>
+        </w:r>
+      </w:hyperlink>
+    </w:p>
+    <w:p>
+      <w:pPr>
+        <w:widowControl/>
+        <w:spacing w:after="120" w:before="120" w:line="300"/>
+        <w:ind w:left="431" w:hanging="431"/>
+      </w:pPr>
+      <w:r>
+        <w:rPr>
+          <w:rFonts w:ascii="Arial" w:cs="Arial" w:eastAsia="Arial" w:hAnsi="Arial"/>
+          <w:sz w:val="24"/>
+          <w:szCs w:val="24"/>
+        </w:rPr>
+        <w:t xml:space="preserve">[11] Fla. Stat. § 61.09 (support unconnected with dissolution; current 2026 text) | </w:t>
+      </w:r>
+      <w:hyperlink w:history="1" r:id="rIdlosllvt7djwdxwnm5aguh">
+        <w:r>
+          <w:rPr>
+            <w:rFonts w:ascii="Arial" w:cs="Arial" w:eastAsia="Arial" w:hAnsi="Arial"/>
+            <w:color w:val="2E5090"/>
+            <w:sz w:val="24"/>
+            <w:szCs w:val="24"/>
+            <w:u w:val="single"/>
+          </w:rPr>
           <w:t xml:space="preserve">https://www.leg.state.fl.us/Statutes/index.cfm?App_mode=Display_Statute&amp;URL=0000-0099/0061/Sections/0061.09.html</w:t>
         </w:r>
       </w:hyperlink>
@@ -2263,9 +2388,9 @@
           <w:sz w:val="24"/>
           <w:szCs w:val="24"/>
         </w:rPr>
-        <w:t xml:space="preserve">[11] Fla. Stat. § 61.10 (support and parenting plan while spouses live apart; current 2026 text) | </w:t>
-      </w:r>
-      <w:hyperlink w:history="1" r:id="rIdqxq90onpnt4ks6utbbbla">
+        <w:t xml:space="preserve">[12] Fla. Stat. § 61.10 (support and parenting plan while spouses live apart; current 2026 text) | </w:t>
+      </w:r>
+      <w:hyperlink w:history="1" r:id="rIdp-f6kzbggu8i_72_szed-">
         <w:r>
           <w:rPr>
             <w:rFonts w:ascii="Arial" w:cs="Arial" w:eastAsia="Arial" w:hAnsi="Arial"/>

</xml_diff>